<commit_message>
feat(v3-1): switch demo manifest assets_provider to curated_local
三处计划外修正(plan §5 假设的 own_default 实际是 own_demo,触发):
- generator COMPANY_ID own_default → own_demo;6 份 demo docx 从 own_default
  目录 git mv 到 own_demo 目录(对齐 demo 项目实际 bidding_entity)
- .gitignore exception 从 own_default 放宽到 own_*(其他 own 公司也能放 demo)
- b_mode_fill main() 读 brief.extracted.bidding_entity 透传给 provider 当 company_id;
  新增 --non-interactive flag,CI 环境(stdin 假性 isatty=True)能自动按
  lookup_priority 选

demo 验证(C1):
- Part 3 (其他资格证明文件):3 个 asset_lookup 全部命中 demo 营业执照
- Part 7 (商务部分):1 个 asset_lookup 命中 demo 张三简历
- assembled.docx 含 "DEMO PLACEHOLDER, NOT REAL ASSET" 标识 + asset 来源行
- 不再含旧"[此处插入 X 材料]"占位
</commit_message>
<xml_diff>
--- a/projects/demo_cadre_training/output/b_mode/其他资格证明文件/assembled.docx
+++ b/projects/demo_cadre_training/output/b_mode/其他资格证明文件/assembled.docx
@@ -22,17 +22,47 @@
     </w:p>
     <w:p>
       <w:r>
-        <w:t>[此处插入 资质证书 材料]</w:t>
+        <w:t>==== DEMO PLACEHOLDER, NOT REAL ASSET ====</w:t>
       </w:r>
     </w:p>
     <w:p>
       <w:r>
-        <w:t xml:space="preserve">  lookup_key: 资质证书|part=其他资格证明文件|section_id=(一)|source=申请人资格要求 3:营业执照</w:t>
+        <w:t>营业执照(DEMO)</w:t>
       </w:r>
     </w:p>
     <w:p>
       <w:r>
-        <w:t xml:space="preserve">  (由 PlaceholderAssetsProvider 产出,真实材料待填)</w:t>
+        <w:t>统一社会信用代码:DEMO-91XXXXXXXXXXXXXXXX</w:t>
+      </w:r>
+    </w:p>
+    <w:p>
+      <w:r>
+        <w:t>公司名称:示例投标方 ALPHA(DEMO)</w:t>
+      </w:r>
+    </w:p>
+    <w:p>
+      <w:r>
+        <w:t>经营范围:信息技术服务、软件开发(DEMO 占位文本,非真实资质)</w:t>
+      </w:r>
+    </w:p>
+    <w:p>
+      <w:r>
+        <w:t>注册资本:1000 万元</w:t>
+      </w:r>
+    </w:p>
+    <w:p>
+      <w:r>
+        <w:t>颁证日期:2025-01-01</w:t>
+      </w:r>
+    </w:p>
+    <w:p>
+      <w:r>
+        <w:t>本文件由 V3-1 demo 生成器产出,真实使用时请走正常摄入流程替换为真实营业执照扫描件。</w:t>
+      </w:r>
+    </w:p>
+    <w:p>
+      <w:r>
+        <w:t>==== DEMO PLACEHOLDER, NOT REAL ASSET ====</w:t>
       </w:r>
     </w:p>
     <w:p>
@@ -40,7 +70,7 @@
         <w:rPr>
           <w:i/>
         </w:rPr>
-        <w:t>(AssetRef 占位: is_placeholder=True, lookup_key=资质证书|part=其他资格证明文件|section_id=(一)|source=申请人资格要求 3:营业执照)</w:t>
+        <w:t>(asset 来源: 20250101_demo_business_license.docx, kind=raw_docx)</w:t>
       </w:r>
     </w:p>
     <w:p>
@@ -54,17 +84,47 @@
     </w:p>
     <w:p>
       <w:r>
-        <w:t>[此处插入 财务报告 材料]</w:t>
+        <w:t>==== DEMO PLACEHOLDER, NOT REAL ASSET ====</w:t>
       </w:r>
     </w:p>
     <w:p>
       <w:r>
-        <w:t xml:space="preserve">  lookup_key: 财务报告|part=其他资格证明文件|section_id=(二)|source=申请人资格要求 4:商业信誉和财务会计制度</w:t>
+        <w:t>营业执照(DEMO)</w:t>
       </w:r>
     </w:p>
     <w:p>
       <w:r>
-        <w:t xml:space="preserve">  (由 PlaceholderAssetsProvider 产出,真实材料待填)</w:t>
+        <w:t>统一社会信用代码:DEMO-91XXXXXXXXXXXXXXXX</w:t>
+      </w:r>
+    </w:p>
+    <w:p>
+      <w:r>
+        <w:t>公司名称:示例投标方 ALPHA(DEMO)</w:t>
+      </w:r>
+    </w:p>
+    <w:p>
+      <w:r>
+        <w:t>经营范围:信息技术服务、软件开发(DEMO 占位文本,非真实资质)</w:t>
+      </w:r>
+    </w:p>
+    <w:p>
+      <w:r>
+        <w:t>注册资本:1000 万元</w:t>
+      </w:r>
+    </w:p>
+    <w:p>
+      <w:r>
+        <w:t>颁证日期:2025-01-01</w:t>
+      </w:r>
+    </w:p>
+    <w:p>
+      <w:r>
+        <w:t>本文件由 V3-1 demo 生成器产出,真实使用时请走正常摄入流程替换为真实营业执照扫描件。</w:t>
+      </w:r>
+    </w:p>
+    <w:p>
+      <w:r>
+        <w:t>==== DEMO PLACEHOLDER, NOT REAL ASSET ====</w:t>
       </w:r>
     </w:p>
     <w:p>
@@ -72,7 +132,7 @@
         <w:rPr>
           <w:i/>
         </w:rPr>
-        <w:t>(AssetRef 占位: is_placeholder=True, lookup_key=财务报告|part=其他资格证明文件|section_id=(二)|source=申请人资格要求 4:商业信誉和财务会计制度)</w:t>
+        <w:t>(asset 来源: 20250101_demo_business_license.docx, kind=raw_docx)</w:t>
       </w:r>
     </w:p>
     <w:p>
@@ -86,17 +146,47 @@
     </w:p>
     <w:p>
       <w:r>
-        <w:t>[此处插入 缴税社保证明 材料]</w:t>
+        <w:t>==== DEMO PLACEHOLDER, NOT REAL ASSET ====</w:t>
       </w:r>
     </w:p>
     <w:p>
       <w:r>
-        <w:t xml:space="preserve">  lookup_key: 缴税社保证明|part=其他资格证明文件|section_id=(三)|source=申请人资格要求 6:依法缴纳税收和社会保障资金</w:t>
+        <w:t>营业执照(DEMO)</w:t>
       </w:r>
     </w:p>
     <w:p>
       <w:r>
-        <w:t xml:space="preserve">  (由 PlaceholderAssetsProvider 产出,真实材料待填)</w:t>
+        <w:t>统一社会信用代码:DEMO-91XXXXXXXXXXXXXXXX</w:t>
+      </w:r>
+    </w:p>
+    <w:p>
+      <w:r>
+        <w:t>公司名称:示例投标方 ALPHA(DEMO)</w:t>
+      </w:r>
+    </w:p>
+    <w:p>
+      <w:r>
+        <w:t>经营范围:信息技术服务、软件开发(DEMO 占位文本,非真实资质)</w:t>
+      </w:r>
+    </w:p>
+    <w:p>
+      <w:r>
+        <w:t>注册资本:1000 万元</w:t>
+      </w:r>
+    </w:p>
+    <w:p>
+      <w:r>
+        <w:t>颁证日期:2025-01-01</w:t>
+      </w:r>
+    </w:p>
+    <w:p>
+      <w:r>
+        <w:t>本文件由 V3-1 demo 生成器产出,真实使用时请走正常摄入流程替换为真实营业执照扫描件。</w:t>
+      </w:r>
+    </w:p>
+    <w:p>
+      <w:r>
+        <w:t>==== DEMO PLACEHOLDER, NOT REAL ASSET ====</w:t>
       </w:r>
     </w:p>
     <w:p>
@@ -104,7 +194,7 @@
         <w:rPr>
           <w:i/>
         </w:rPr>
-        <w:t>(AssetRef 占位: is_placeholder=True, lookup_key=缴税社保证明|part=其他资格证明文件|section_id=(三)|source=申请人资格要求 6:依法缴纳税收和社会保障资金)</w:t>
+        <w:t>(asset 来源: 20250101_demo_business_license.docx, kind=raw_docx)</w:t>
       </w:r>
     </w:p>
     <w:p>

</xml_diff>